<commit_message>
Embed figures (SVG + PNG fallback) into stroke article Word document
</commit_message>
<xml_diff>
--- a/Sex_Differences_Stroke_Research_Article.docx
+++ b/Sex_Differences_Stroke_Research_Article.docx
@@ -1,6 +1,6 @@
 
 <file path=word/document.xml><?xml version="1.0" encoding="utf-8"?>
-<w:document xmlns:w="http://schemas.openxmlformats.org/wordprocessingml/2006/main">
+<w:document xmlns:w="http://schemas.openxmlformats.org/wordprocessingml/2006/main" xmlns:r="http://schemas.openxmlformats.org/officeDocument/2006/relationships" xmlns:wp="http://schemas.openxmlformats.org/drawingml/2006/wordprocessingDrawing" xmlns:a="http://schemas.openxmlformats.org/drawingml/2006/main" xmlns:pic="http://schemas.openxmlformats.org/drawingml/2006/picture">
   <w:body>
     <w:p>
       <w:pPr>
@@ -1230,13 +1230,61 @@
     </w:p>
     <w:p>
       <w:pPr>
-        <w:spacing w:before="120" w:after="120"/>
-      </w:pPr>
-      <w:r>
-        <w:rPr>
-          <w:i/>
+        <w:spacing w:before="40" w:after="40"/>
+        <w:jc w:val="center"/>
+      </w:pPr>
+      <w:r>
+        <w:rPr>
+          <w:color w:val="555555"/>
         </w:rPr>
         <w:t xml:space="preserve">Figure 1 — `stroke_figures/fig1_mrs.svg`.</w:t>
+      </w:r>
+    </w:p>
+    <w:p>
+      <w:pPr>
+        <w:jc w:val="center"/>
+        <w:spacing w:before="60" w:after="60"/>
+      </w:pPr>
+      <w:r>
+        <w:drawing>
+          <wp:inline distT="0" distB="0" distL="0" distR="0">
+            <wp:extent cx="5486400" cy="2165684"/>
+            <wp:effectExtent l="0" t="0" r="0" b="0"/>
+            <wp:docPr id="1" name="Figure1"/>
+            <wp:cNvGraphicFramePr/>
+            <a:graphic xmlns:a="http://schemas.openxmlformats.org/drawingml/2006/main">
+              <a:graphicData uri="http://schemas.openxmlformats.org/drawingml/2006/picture">
+                <pic:pic xmlns:pic="http://schemas.openxmlformats.org/drawingml/2006/picture">
+                  <pic:nvPicPr>
+                    <pic:cNvPr id="1" name="Figure1"/>
+                    <pic:cNvPicPr/>
+                  </pic:nvPicPr>
+                  <pic:blipFill>
+                    <a:blip r:embed="rId1">
+                      <a:extLst>
+                        <a:ext uri="{96DAC541-7B7A-43D3-8B79-37D633B846F1}">
+                          <asvg:svgBlip xmlns:asvg="http://schemas.microsoft.com/office/drawing/2016/SVG/main" r:embed="rId2"/>
+                        </a:ext>
+                      </a:extLst>
+                    </a:blip>
+                    <a:stretch>
+                      <a:fillRect/>
+                    </a:stretch>
+                  </pic:blipFill>
+                  <pic:spPr>
+                    <a:xfrm>
+                      <a:off x="0" y="0"/>
+                      <a:ext cx="5486400" cy="2165684"/>
+                    </a:xfrm>
+                    <a:prstGeom prst="rect">
+                      <a:avLst/>
+                    </a:prstGeom>
+                  </pic:spPr>
+                </pic:pic>
+              </a:graphicData>
+            </a:graphic>
+          </wp:inline>
+        </w:drawing>
       </w:r>
     </w:p>
     <w:p>
@@ -1290,13 +1338,61 @@
     </w:p>
     <w:p>
       <w:pPr>
-        <w:spacing w:before="120" w:after="120"/>
-      </w:pPr>
-      <w:r>
-        <w:rPr>
-          <w:i/>
+        <w:spacing w:before="40" w:after="40"/>
+        <w:jc w:val="center"/>
+      </w:pPr>
+      <w:r>
+        <w:rPr>
+          <w:color w:val="555555"/>
         </w:rPr>
         <w:t xml:space="preserve">Figure 3 — `stroke_figures/fig3_outcomes.svg`.</w:t>
+      </w:r>
+    </w:p>
+    <w:p>
+      <w:pPr>
+        <w:jc w:val="center"/>
+        <w:spacing w:before="60" w:after="60"/>
+      </w:pPr>
+      <w:r>
+        <w:drawing>
+          <wp:inline distT="0" distB="0" distL="0" distR="0">
+            <wp:extent cx="5486400" cy="2895600"/>
+            <wp:effectExtent l="0" t="0" r="0" b="0"/>
+            <wp:docPr id="2" name="Figure2"/>
+            <wp:cNvGraphicFramePr/>
+            <a:graphic xmlns:a="http://schemas.openxmlformats.org/drawingml/2006/main">
+              <a:graphicData uri="http://schemas.openxmlformats.org/drawingml/2006/picture">
+                <pic:pic xmlns:pic="http://schemas.openxmlformats.org/drawingml/2006/picture">
+                  <pic:nvPicPr>
+                    <pic:cNvPr id="2" name="Figure2"/>
+                    <pic:cNvPicPr/>
+                  </pic:nvPicPr>
+                  <pic:blipFill>
+                    <a:blip r:embed="rId3">
+                      <a:extLst>
+                        <a:ext uri="{96DAC541-7B7A-43D3-8B79-37D633B846F1}">
+                          <asvg:svgBlip xmlns:asvg="http://schemas.microsoft.com/office/drawing/2016/SVG/main" r:embed="rId4"/>
+                        </a:ext>
+                      </a:extLst>
+                    </a:blip>
+                    <a:stretch>
+                      <a:fillRect/>
+                    </a:stretch>
+                  </pic:blipFill>
+                  <pic:spPr>
+                    <a:xfrm>
+                      <a:off x="0" y="0"/>
+                      <a:ext cx="5486400" cy="2895600"/>
+                    </a:xfrm>
+                    <a:prstGeom prst="rect">
+                      <a:avLst/>
+                    </a:prstGeom>
+                  </pic:spPr>
+                </pic:pic>
+              </a:graphicData>
+            </a:graphic>
+          </wp:inline>
+        </w:drawing>
       </w:r>
     </w:p>
     <w:p>
@@ -2062,13 +2158,61 @@
     <w:p/>
     <w:p>
       <w:pPr>
-        <w:spacing w:before="120" w:after="120"/>
-      </w:pPr>
-      <w:r>
-        <w:rPr>
-          <w:i/>
+        <w:spacing w:before="40" w:after="40"/>
+        <w:jc w:val="center"/>
+      </w:pPr>
+      <w:r>
+        <w:rPr>
+          <w:color w:val="555555"/>
         </w:rPr>
         <w:t xml:space="preserve">Figure 2 — `stroke_figures/fig2_forest.svg`.</w:t>
+      </w:r>
+    </w:p>
+    <w:p>
+      <w:pPr>
+        <w:jc w:val="center"/>
+        <w:spacing w:before="60" w:after="60"/>
+      </w:pPr>
+      <w:r>
+        <w:drawing>
+          <wp:inline distT="0" distB="0" distL="0" distR="0">
+            <wp:extent cx="5486400" cy="2714324"/>
+            <wp:effectExtent l="0" t="0" r="0" b="0"/>
+            <wp:docPr id="3" name="Figure3"/>
+            <wp:cNvGraphicFramePr/>
+            <a:graphic xmlns:a="http://schemas.openxmlformats.org/drawingml/2006/main">
+              <a:graphicData uri="http://schemas.openxmlformats.org/drawingml/2006/picture">
+                <pic:pic xmlns:pic="http://schemas.openxmlformats.org/drawingml/2006/picture">
+                  <pic:nvPicPr>
+                    <pic:cNvPr id="3" name="Figure3"/>
+                    <pic:cNvPicPr/>
+                  </pic:nvPicPr>
+                  <pic:blipFill>
+                    <a:blip r:embed="rId5">
+                      <a:extLst>
+                        <a:ext uri="{96DAC541-7B7A-43D3-8B79-37D633B846F1}">
+                          <asvg:svgBlip xmlns:asvg="http://schemas.microsoft.com/office/drawing/2016/SVG/main" r:embed="rId6"/>
+                        </a:ext>
+                      </a:extLst>
+                    </a:blip>
+                    <a:stretch>
+                      <a:fillRect/>
+                    </a:stretch>
+                  </pic:blipFill>
+                  <pic:spPr>
+                    <a:xfrm>
+                      <a:off x="0" y="0"/>
+                      <a:ext cx="5486400" cy="2714324"/>
+                    </a:xfrm>
+                    <a:prstGeom prst="rect">
+                      <a:avLst/>
+                    </a:prstGeom>
+                  </pic:spPr>
+                </pic:pic>
+              </a:graphicData>
+            </a:graphic>
+          </wp:inline>
+        </w:drawing>
       </w:r>
     </w:p>
     <w:p>

</xml_diff>